<commit_message>
Enhance Presentation Notes with Architecture Diagram and Deep Viva Q&A
</commit_message>
<xml_diff>
--- a/Presentation_Notes_Akshat.docx
+++ b/Presentation_Notes_Akshat.docx
@@ -11,9 +11,9 @@
         <w:rPr>
           <w:b/>
           <w:color w:val="4B0082"/>
-          <w:sz w:val="36"/>
+          <w:sz w:val="40"/>
         </w:rPr>
-        <w:t>Presentation &amp; Viva Notes</w:t>
+        <w:t>Complete Deep-Dive Viva &amp; Presentation Guide</w:t>
       </w:r>
     </w:p>
     <w:p>
@@ -25,7 +25,7 @@
         <w:rPr>
           <w:b/>
           <w:color w:val="4B0082"/>
-          <w:sz w:val="36"/>
+          <w:sz w:val="40"/>
         </w:rPr>
         <w:t>Social Media Trends Analytics Dashboard</w:t>
       </w:r>
@@ -39,7 +39,22 @@
           <w:rFonts w:ascii="Calibri" w:hAnsi="Calibri"/>
           <w:sz w:val="22"/>
         </w:rPr>
-        <w:t>Use these notes to explain your project in simple English during your presentation. It covers what you built, how it works, and the most common questions your teacher might ask.</w:t>
+        <w:t xml:space="preserve">This document contains a visual breakdown, architecture details, and an exhaustive list of in-depth technical questions for your presentation. Be prepared to explain exactly </w:t>
+      </w:r>
+      <w:r>
+        <w:rPr>
+          <w:rFonts w:ascii="Calibri" w:hAnsi="Calibri"/>
+          <w:b/>
+          <w:sz w:val="22"/>
+        </w:rPr>
+        <w:t>how</w:t>
+      </w:r>
+      <w:r>
+        <w:rPr>
+          <w:rFonts w:ascii="Calibri" w:hAnsi="Calibri"/>
+          <w:sz w:val="22"/>
+        </w:rPr>
+        <w:t xml:space="preserve"> the code works behind the scenes.</w:t>
       </w:r>
     </w:p>
     <w:p>
@@ -50,9 +65,9 @@
         <w:rPr>
           <w:b/>
           <w:color w:val="003366"/>
-          <w:sz w:val="28"/>
+          <w:sz w:val="32"/>
         </w:rPr>
-        <w:t>1. Project Introduction (How to Start)</w:t>
+        <w:t>1. Architecture &amp; Working Mechanism</w:t>
       </w:r>
     </w:p>
     <w:p>
@@ -64,19 +79,46 @@
           <w:rFonts w:ascii="Calibri" w:hAnsi="Calibri"/>
           <w:sz w:val="22"/>
         </w:rPr>
-        <w:t>Start your presentation by saying:</w:t>
+        <w:t>Below is the visual representation of how data flows through the application:</w:t>
       </w:r>
     </w:p>
     <w:p>
       <w:pPr>
-        <w:spacing w:after="120"/>
+        <w:jc w:val="center"/>
       </w:pPr>
       <w:r>
-        <w:rPr>
-          <w:rFonts w:ascii="Calibri" w:hAnsi="Calibri"/>
-          <w:sz w:val="22"/>
-        </w:rPr>
-        <w:t>"Good morning/afternoon. My project is a Desktop Dashboard for analyzing Social Media Trends. Today, businesses need to know where to post their content (like Twitter or Instagram) and what topics are trending. I built a Python application that reads 2000 records of social media data and turns it into beautiful, easy-to-understand charts."</w:t>
+        <w:drawing>
+          <wp:inline xmlns:a="http://schemas.openxmlformats.org/drawingml/2006/main" xmlns:pic="http://schemas.openxmlformats.org/drawingml/2006/picture">
+            <wp:extent cx="5486400" cy="2708476"/>
+            <wp:docPr id="1" name="Picture 1"/>
+            <wp:cNvGraphicFramePr>
+              <a:graphicFrameLocks noChangeAspect="1"/>
+            </wp:cNvGraphicFramePr>
+            <a:graphic>
+              <a:graphicData uri="http://schemas.openxmlformats.org/drawingml/2006/picture">
+                <pic:pic>
+                  <pic:nvPicPr>
+                    <pic:cNvPr id="0" name="architecture_diagram.png"/>
+                    <pic:cNvPicPr/>
+                  </pic:nvPicPr>
+                  <pic:blipFill>
+                    <a:blip r:embed="rId9"/>
+                    <a:stretch>
+                      <a:fillRect/>
+                    </a:stretch>
+                  </pic:blipFill>
+                  <pic:spPr>
+                    <a:xfrm>
+                      <a:off x="0" y="0"/>
+                      <a:ext cx="5486400" cy="2708476"/>
+                    </a:xfrm>
+                    <a:prstGeom prst="rect"/>
+                  </pic:spPr>
+                </pic:pic>
+              </a:graphicData>
+            </a:graphic>
+          </wp:inline>
+        </w:drawing>
       </w:r>
     </w:p>
     <w:p>
@@ -86,10 +128,10 @@
       <w:r>
         <w:rPr>
           <w:b/>
-          <w:color w:val="003366"/>
-          <w:sz w:val="28"/>
+          <w:color w:val="2980B9"/>
+          <w:sz w:val="26"/>
         </w:rPr>
-        <w:t>2. Explaining the Technologies Used</w:t>
+        <w:t>Deep Working Breakdown:</w:t>
       </w:r>
     </w:p>
     <w:p>
@@ -99,12 +141,18 @@
       </w:pPr>
       <w:r>
         <w:rPr>
+          <w:rFonts w:ascii="Calibri" w:hAnsi="Calibri"/>
           <w:b/>
+          <w:sz w:val="22"/>
         </w:rPr>
-        <w:t>Pandas:</w:t>
+        <w:t>1. Data Extraction:</w:t>
       </w:r>
       <w:r>
-        <w:t xml:space="preserve"> Used to load, clean, and group the data very quickly.</w:t>
+        <w:rPr>
+          <w:rFonts w:ascii="Calibri" w:hAnsi="Calibri"/>
+          <w:sz w:val="22"/>
+        </w:rPr>
+        <w:t xml:space="preserve"> The program reads `Social_Media_Trends_India.csv` using `pd.read_csv()`.</w:t>
       </w:r>
     </w:p>
     <w:p>
@@ -114,12 +162,18 @@
       </w:pPr>
       <w:r>
         <w:rPr>
+          <w:rFonts w:ascii="Calibri" w:hAnsi="Calibri"/>
           <w:b/>
+          <w:sz w:val="22"/>
         </w:rPr>
-        <w:t>Matplotlib:</w:t>
+        <w:t>2. Data Engine (Pandas):</w:t>
       </w:r>
       <w:r>
-        <w:t xml:space="preserve"> Used to draw the actual graphs (bar charts, pie charts, heatmaps).</w:t>
+        <w:rPr>
+          <w:rFonts w:ascii="Calibri" w:hAnsi="Calibri"/>
+          <w:sz w:val="22"/>
+        </w:rPr>
+        <w:t xml:space="preserve"> Functions like `.groupby()`, `.sum()`, and `.mean()` are used to aggregate millions of views and likes instantly. Missing values are gracefully handled using `.dropna()` or fallback defaults.</w:t>
       </w:r>
     </w:p>
     <w:p>
@@ -129,25 +183,18 @@
       </w:pPr>
       <w:r>
         <w:rPr>
+          <w:rFonts w:ascii="Calibri" w:hAnsi="Calibri"/>
           <w:b/>
+          <w:sz w:val="22"/>
         </w:rPr>
-        <w:t>Tkinter:</w:t>
+        <w:t>3. Visualization Generation (Matplotlib):</w:t>
       </w:r>
       <w:r>
-        <w:t xml:space="preserve"> Used to build the Desktop Window (GUI) so the user can click tabs and see the data without looking at code.</w:t>
-      </w:r>
-    </w:p>
-    <w:p>
-      <w:pPr>
-        <w:spacing w:after="160" w:before="240"/>
-      </w:pPr>
-      <w:r>
         <w:rPr>
-          <w:b/>
-          <w:color w:val="003366"/>
-          <w:sz w:val="28"/>
+          <w:rFonts w:ascii="Calibri" w:hAnsi="Calibri"/>
+          <w:sz w:val="22"/>
         </w:rPr>
-        <w:t>3. Explaining the Visualizations (Page by Page)</w:t>
+        <w:t xml:space="preserve"> Pandas dataframes are passed into Matplotlib subplots (`ax.barh()`, `ax.pie()`). I used `GridSpec` to align multiple charts perfectly on one screen.</w:t>
       </w:r>
     </w:p>
     <w:p>
@@ -157,72 +204,18 @@
       </w:pPr>
       <w:r>
         <w:rPr>
+          <w:rFonts w:ascii="Calibri" w:hAnsi="Calibri"/>
           <w:b/>
+          <w:sz w:val="22"/>
         </w:rPr>
-        <w:t>Page 1 - Overview:</w:t>
+        <w:t>4. GUI Integration (Tkinter):</w:t>
       </w:r>
       <w:r>
-        <w:t xml:space="preserve"> Shows the 'Big Picture'. We have Key Performance Indicators (KPIs) showing total views and likes. The Donut Chart shows which categories have the most posts. The charts prove which platform gets the most traffic overall.</w:t>
-      </w:r>
-    </w:p>
-    <w:p>
-      <w:pPr>
-        <w:pStyle w:val="ListBullet"/>
-        <w:spacing w:after="80"/>
-      </w:pPr>
-      <w:r>
         <w:rPr>
-          <w:b/>
+          <w:rFonts w:ascii="Calibri" w:hAnsi="Calibri"/>
+          <w:sz w:val="22"/>
         </w:rPr>
-        <w:t>Page 2 - Platform Analysis:</w:t>
-      </w:r>
-      <w:r>
-        <w:t xml:space="preserve"> Here, I compare platforms side-by-side. You can easily see if Instagram gets more likes than TikTok. It helps businesses decide where to spend their marketing budget.</w:t>
-      </w:r>
-    </w:p>
-    <w:p>
-      <w:pPr>
-        <w:pStyle w:val="ListBullet"/>
-        <w:spacing w:after="80"/>
-      </w:pPr>
-      <w:r>
-        <w:rPr>
-          <w:b/>
-        </w:rPr>
-        <w:t>Page 3 - Category Trends:</w:t>
-      </w:r>
-      <w:r>
-        <w:t xml:space="preserve"> This tells us WHAT people want to see. Are they watching Sports or Tech? The bar charts rank the categories by engagement.</w:t>
-      </w:r>
-    </w:p>
-    <w:p>
-      <w:pPr>
-        <w:pStyle w:val="ListBullet"/>
-        <w:spacing w:after="80"/>
-      </w:pPr>
-      <w:r>
-        <w:rPr>
-          <w:b/>
-        </w:rPr>
-        <w:t>Page 4 - Hashtag Rankings:</w:t>
-      </w:r>
-      <w:r>
-        <w:t xml:space="preserve"> I made a scrollable table and two charts showing the absolute best and worst hashtags. This tells us what words to use in a post to go viral.</w:t>
-      </w:r>
-    </w:p>
-    <w:p>
-      <w:pPr>
-        <w:pStyle w:val="ListBullet"/>
-        <w:spacing w:after="80"/>
-      </w:pPr>
-      <w:r>
-        <w:rPr>
-          <w:b/>
-        </w:rPr>
-        <w:t>Page 5 - Heatmap:</w:t>
-      </w:r>
-      <w:r>
-        <w:t xml:space="preserve"> This is the most advanced chart. It compares two things at once (Platform vs Category). Dark colors mean 'Hot/High Engagement', light colors mean 'Cold/Low'. For example, if Gaming on YouTube is dark colored, it means that's a perfect match.</w:t>
+        <w:t xml:space="preserve"> The Matplotlib `Figure` is embedded into the Tkinter window using a special bridge called `FigureCanvasTkAgg`. This prevents opening separate pop-up windows and keeps everything inside one unified dashboard.</w:t>
       </w:r>
     </w:p>
     <w:p>
@@ -238,17 +231,18 @@
         <w:rPr>
           <w:b/>
           <w:color w:val="003366"/>
-          <w:sz w:val="28"/>
+          <w:sz w:val="32"/>
         </w:rPr>
-        <w:t>4. Frequently Asked Questions (Viva Q&amp;A)</w:t>
+        <w:t>2. Advanced Viva Questions (Deep Technical)</w:t>
       </w:r>
     </w:p>
     <w:p>
       <w:r>
         <w:rPr>
           <w:b/>
+          <w:color w:val="C0392B"/>
         </w:rPr>
-        <w:t>Q: Why did you use Tkinter and not a website framework like HTML/Django?</w:t>
+        <w:t>Q: How did you integrate Matplotlib graphs directly inside Tkinter?</w:t>
       </w:r>
     </w:p>
     <w:p>
@@ -260,15 +254,30 @@
           <w:rFonts w:ascii="Calibri" w:hAnsi="Calibri"/>
           <w:sz w:val="22"/>
         </w:rPr>
-        <w:t>Answer: I wanted to build a standalone desktop application. Tkinter is built right into Python and connects very smoothly with Matplotlib to embed graphs directly into the window without needing a browser.</w:t>
+      </w:r>
+      <w:r>
+        <w:rPr>
+          <w:rFonts w:ascii="Calibri" w:hAnsi="Calibri"/>
+          <w:b/>
+          <w:sz w:val="22"/>
+        </w:rPr>
+        <w:t>Answer:</w:t>
+      </w:r>
+      <w:r>
+        <w:rPr>
+          <w:rFonts w:ascii="Calibri" w:hAnsi="Calibri"/>
+          <w:sz w:val="22"/>
+        </w:rPr>
+        <w:t xml:space="preserve"> Instead of using `plt.show()` (which opens a separate window), I used `FigureCanvasTkAgg`. This takes a Matplotlib `Figure` object and converts it into a Tkinter `Canvas` widget, allowing me to pack it directly into the dashboard frames.</w:t>
       </w:r>
     </w:p>
     <w:p>
       <w:r>
         <w:rPr>
           <w:b/>
+          <w:color w:val="C0392B"/>
         </w:rPr>
-        <w:t>Q: How did you handle the large amount of data?</w:t>
+        <w:t>Q: What is GridSpec and why did you use it instead of regular subplots?</w:t>
       </w:r>
     </w:p>
     <w:p>
@@ -280,15 +289,30 @@
           <w:rFonts w:ascii="Calibri" w:hAnsi="Calibri"/>
           <w:sz w:val="22"/>
         </w:rPr>
-        <w:t>Answer: I used Pandas DataFrames. Instead of using slow 'for' loops, I used Pandas built-in functions like '.groupby()' and '.sum()' which are optimized in C and calculate the totals instantly.</w:t>
+      </w:r>
+      <w:r>
+        <w:rPr>
+          <w:rFonts w:ascii="Calibri" w:hAnsi="Calibri"/>
+          <w:b/>
+          <w:sz w:val="22"/>
+        </w:rPr>
+        <w:t>Answer:</w:t>
+      </w:r>
+      <w:r>
+        <w:rPr>
+          <w:rFonts w:ascii="Calibri" w:hAnsi="Calibri"/>
+          <w:sz w:val="22"/>
+        </w:rPr>
+        <w:t xml:space="preserve"> `GridSpec` is a Matplotlib module that allows custom layouts. Unlike `plt.subplots()`, GridSpec lets me control exact spacing (hspace/wspace) and span charts across multiple rows or columns, which is essential for a clean dashboard look.</w:t>
       </w:r>
     </w:p>
     <w:p>
       <w:r>
         <w:rPr>
           <w:b/>
+          <w:color w:val="C0392B"/>
         </w:rPr>
-        <w:t>Q: What is 'Engagement Rate' and how did you calculate it?</w:t>
+        <w:t>Q: Your dataset has 2,000 rows. How do you prevent the UI from freezing when processing data?</w:t>
       </w:r>
     </w:p>
     <w:p>
@@ -300,15 +324,30 @@
           <w:rFonts w:ascii="Calibri" w:hAnsi="Calibri"/>
           <w:sz w:val="22"/>
         </w:rPr>
-        <w:t>Answer: Engagement Rate is the percentage of people who actually liked, commented, or shared after seeing the post, not just scrolling past it. It shows the true quality of the content.</w:t>
+      </w:r>
+      <w:r>
+        <w:rPr>
+          <w:rFonts w:ascii="Calibri" w:hAnsi="Calibri"/>
+          <w:b/>
+          <w:sz w:val="22"/>
+        </w:rPr>
+        <w:t>Answer:</w:t>
+      </w:r>
+      <w:r>
+        <w:rPr>
+          <w:rFonts w:ascii="Calibri" w:hAnsi="Calibri"/>
+          <w:sz w:val="22"/>
+        </w:rPr>
+        <w:t xml:space="preserve"> Pandas handles operations via vectorized C-code under the hood. Using `df.groupby('platform')['views'].sum()` calculates results in milliseconds. Because the calculation is so fast, the UI main loop (`mainloop()`) isn't blocked.</w:t>
       </w:r>
     </w:p>
     <w:p>
       <w:r>
         <w:rPr>
           <w:b/>
+          <w:color w:val="C0392B"/>
         </w:rPr>
-        <w:t>Q: Why did you choose the dark 'Midnight Purple' theme?</w:t>
+        <w:t>Q: How did you create the Heatmap without using Seaborn?</w:t>
       </w:r>
     </w:p>
     <w:p>
@@ -320,15 +359,30 @@
           <w:rFonts w:ascii="Calibri" w:hAnsi="Calibri"/>
           <w:sz w:val="22"/>
         </w:rPr>
-        <w:t>Answer: Dark mode is an industry standard for professional analytics dashboards (like Bloomberg or Grafana). It reduces eye strain, makes the bright colors of the charts pop out, and looks highly premium.</w:t>
+      </w:r>
+      <w:r>
+        <w:rPr>
+          <w:rFonts w:ascii="Calibri" w:hAnsi="Calibri"/>
+          <w:b/>
+          <w:sz w:val="22"/>
+        </w:rPr>
+        <w:t>Answer:</w:t>
+      </w:r>
+      <w:r>
+        <w:rPr>
+          <w:rFonts w:ascii="Calibri" w:hAnsi="Calibri"/>
+          <w:sz w:val="22"/>
+        </w:rPr>
+        <w:t xml:space="preserve"> I used Matplotlib's `ax.imshow()`. I created a 2D matrix using Pandas `pivot_table(index='platform', columns='category', values='engagement_rate')`, then passed that matrix into `imshow()` with the 'magma' colormap. I mathematically calculated text color (white/black) based on the cell's background luminance so the text is always readable.</w:t>
       </w:r>
     </w:p>
     <w:p>
       <w:r>
         <w:rPr>
           <w:b/>
+          <w:color w:val="C0392B"/>
         </w:rPr>
-        <w:t>Q: What is the Heatmap showing exactly?</w:t>
+        <w:t>Q: What happens if your CSV file is missing or corrupted?</w:t>
       </w:r>
     </w:p>
     <w:p>
@@ -340,20 +394,30 @@
           <w:rFonts w:ascii="Calibri" w:hAnsi="Calibri"/>
           <w:sz w:val="22"/>
         </w:rPr>
-        <w:t>Answer: The Heatmap is a 2D matrix. It answers complex questions like 'Does Fashion content perform better on Instagram or Twitter?'. The color intensity gives the answer instantly without looking at raw numbers.</w:t>
+      </w:r>
+      <w:r>
+        <w:rPr>
+          <w:rFonts w:ascii="Calibri" w:hAnsi="Calibri"/>
+          <w:b/>
+          <w:sz w:val="22"/>
+        </w:rPr>
+        <w:t>Answer:</w:t>
+      </w:r>
+      <w:r>
+        <w:rPr>
+          <w:rFonts w:ascii="Calibri" w:hAnsi="Calibri"/>
+          <w:sz w:val="22"/>
+        </w:rPr>
+        <w:t xml:space="preserve"> I built an Exception Handler (`try-except` block) inside the `load_data()` function. If the CSV is missing, the program catches the `FileNotFoundError` and returns an empty DataFrame with the correct column names, preventing the entire GUI from crashing.</w:t>
       </w:r>
     </w:p>
     <w:p>
-      <w:pPr>
-        <w:spacing w:after="160" w:before="240"/>
-      </w:pPr>
       <w:r>
         <w:rPr>
           <w:b/>
-          <w:color w:val="003366"/>
-          <w:sz w:val="28"/>
+          <w:color w:val="C0392B"/>
         </w:rPr>
-        <w:t>5. Conclusion (How to End)</w:t>
+        <w:t>Q: Explain how the Engagement Rate is calculated.</w:t>
       </w:r>
     </w:p>
     <w:p>
@@ -365,7 +429,30 @@
           <w:rFonts w:ascii="Calibri" w:hAnsi="Calibri"/>
           <w:sz w:val="22"/>
         </w:rPr>
-        <w:t>End your presentation by saying:</w:t>
+      </w:r>
+      <w:r>
+        <w:rPr>
+          <w:rFonts w:ascii="Calibri" w:hAnsi="Calibri"/>
+          <w:b/>
+          <w:sz w:val="22"/>
+        </w:rPr>
+        <w:t>Answer:</w:t>
+      </w:r>
+      <w:r>
+        <w:rPr>
+          <w:rFonts w:ascii="Calibri" w:hAnsi="Calibri"/>
+          <w:sz w:val="22"/>
+        </w:rPr>
+        <w:t xml:space="preserve"> Engagement Rate = (Total Likes + Total Comments + Total Shares) / Total Views * 100. It is a critical metric because a post with 1,000,000 views but only 10 likes has terrible engagement, whereas a post with 1,000 views and 500 likes is highly viral.</w:t>
+      </w:r>
+    </w:p>
+    <w:p>
+      <w:r>
+        <w:rPr>
+          <w:b/>
+          <w:color w:val="C0392B"/>
+        </w:rPr>
+        <w:t>Q: How did you implement the Scrollable Table in Tkinter?</w:t>
       </w:r>
     </w:p>
     <w:p>
@@ -377,7 +464,209 @@
           <w:rFonts w:ascii="Calibri" w:hAnsi="Calibri"/>
           <w:sz w:val="22"/>
         </w:rPr>
-        <w:t>"To conclude, this dashboard successfully transforms raw, boring CSV data into actionable business intelligence. It proves my skills in data wrangling, statistical grouping, and advanced GUI development in Python. Thank you."</w:t>
+      </w:r>
+      <w:r>
+        <w:rPr>
+          <w:rFonts w:ascii="Calibri" w:hAnsi="Calibri"/>
+          <w:b/>
+          <w:sz w:val="22"/>
+        </w:rPr>
+        <w:t>Answer:</w:t>
+      </w:r>
+      <w:r>
+        <w:rPr>
+          <w:rFonts w:ascii="Calibri" w:hAnsi="Calibri"/>
+          <w:sz w:val="22"/>
+        </w:rPr>
+        <w:t xml:space="preserve"> Tkinter Frames don't support scrolling natively. I created a `Canvas` widget and put a `Frame` inside it (`create_window`). I then attached a `ttk.Scrollbar` to the Canvas and configured the `scrollregion` to update dynamically when the inner frame changes size.</w:t>
+      </w:r>
+    </w:p>
+    <w:p>
+      <w:r>
+        <w:rPr>
+          <w:b/>
+          <w:color w:val="C0392B"/>
+        </w:rPr>
+        <w:t>Q: Why did you build your own dashboard instead of using PowerBI or Tableau?</w:t>
+      </w:r>
+    </w:p>
+    <w:p>
+      <w:pPr>
+        <w:spacing w:after="120"/>
+      </w:pPr>
+      <w:r>
+        <w:rPr>
+          <w:rFonts w:ascii="Calibri" w:hAnsi="Calibri"/>
+          <w:sz w:val="22"/>
+        </w:rPr>
+      </w:r>
+      <w:r>
+        <w:rPr>
+          <w:rFonts w:ascii="Calibri" w:hAnsi="Calibri"/>
+          <w:b/>
+          <w:sz w:val="22"/>
+        </w:rPr>
+        <w:t>Answer:</w:t>
+      </w:r>
+      <w:r>
+        <w:rPr>
+          <w:rFonts w:ascii="Calibri" w:hAnsi="Calibri"/>
+          <w:sz w:val="22"/>
+        </w:rPr>
+        <w:t xml:space="preserve"> Building it in Python demonstrates strong programmatic skills. Unlike drag-and-drop tools like PowerBI, building this required deep knowledge of Data Structures, Object-Oriented/Procedural UI design, and Data Aggregation logic. It proves I can build custom analytics solutions from scratch.</w:t>
+      </w:r>
+    </w:p>
+    <w:p>
+      <w:r>
+        <w:br w:type="page"/>
+      </w:r>
+    </w:p>
+    <w:p>
+      <w:pPr>
+        <w:spacing w:after="160" w:before="240"/>
+      </w:pPr>
+      <w:r>
+        <w:rPr>
+          <w:b/>
+          <w:color w:val="003366"/>
+          <w:sz w:val="32"/>
+        </w:rPr>
+        <w:t>3. Visual Representation &amp; Page Breakdown</w:t>
+      </w:r>
+    </w:p>
+    <w:p>
+      <w:pPr>
+        <w:spacing w:after="120"/>
+      </w:pPr>
+      <w:r>
+        <w:rPr>
+          <w:rFonts w:ascii="Calibri" w:hAnsi="Calibri"/>
+          <w:sz w:val="22"/>
+        </w:rPr>
+        <w:t>Use these exact explanations when changing tabs during the presentation:</w:t>
+      </w:r>
+    </w:p>
+    <w:p>
+      <w:pPr>
+        <w:spacing w:after="160" w:before="240"/>
+      </w:pPr>
+      <w:r>
+        <w:rPr>
+          <w:b/>
+          <w:color w:val="2980B9"/>
+          <w:sz w:val="26"/>
+        </w:rPr>
+        <w:t>Tab 1: Executive Overview</w:t>
+      </w:r>
+    </w:p>
+    <w:p>
+      <w:pPr>
+        <w:pStyle w:val="ListBullet"/>
+        <w:spacing w:after="80"/>
+      </w:pPr>
+      <w:r>
+        <w:rPr>
+          <w:rFonts w:ascii="Calibri" w:hAnsi="Calibri"/>
+          <w:b/>
+          <w:sz w:val="22"/>
+        </w:rPr>
+        <w:t>Left Panel:</w:t>
+      </w:r>
+      <w:r>
+        <w:rPr>
+          <w:rFonts w:ascii="Calibri" w:hAnsi="Calibri"/>
+          <w:sz w:val="22"/>
+        </w:rPr>
+        <w:t xml:space="preserve"> Points out the macro-metrics (Total Views, Likes, Posts).</w:t>
+      </w:r>
+    </w:p>
+    <w:p>
+      <w:pPr>
+        <w:pStyle w:val="ListBullet"/>
+        <w:spacing w:after="80"/>
+      </w:pPr>
+      <w:r>
+        <w:rPr>
+          <w:rFonts w:ascii="Calibri" w:hAnsi="Calibri"/>
+          <w:b/>
+          <w:sz w:val="22"/>
+        </w:rPr>
+        <w:t>Right Panel:</w:t>
+      </w:r>
+      <w:r>
+        <w:rPr>
+          <w:rFonts w:ascii="Calibri" w:hAnsi="Calibri"/>
+          <w:sz w:val="22"/>
+        </w:rPr>
+        <w:t xml:space="preserve"> The Donut Chart calculates the percentage distribution of categories, helping us quickly identify the dominating content type.</w:t>
+      </w:r>
+    </w:p>
+    <w:p>
+      <w:pPr>
+        <w:spacing w:after="160" w:before="240"/>
+      </w:pPr>
+      <w:r>
+        <w:rPr>
+          <w:b/>
+          <w:color w:val="2980B9"/>
+          <w:sz w:val="26"/>
+        </w:rPr>
+        <w:t>Tab 2: Platform Analysis</w:t>
+      </w:r>
+    </w:p>
+    <w:p>
+      <w:pPr>
+        <w:pStyle w:val="ListBullet"/>
+        <w:spacing w:after="80"/>
+      </w:pPr>
+      <w:r>
+        <w:rPr>
+          <w:rFonts w:ascii="Calibri" w:hAnsi="Calibri"/>
+          <w:b/>
+          <w:sz w:val="22"/>
+        </w:rPr>
+        <w:t>Logic:</w:t>
+      </w:r>
+      <w:r>
+        <w:rPr>
+          <w:rFonts w:ascii="Calibri" w:hAnsi="Calibri"/>
+          <w:sz w:val="22"/>
+        </w:rPr>
+        <w:t xml:space="preserve"> Puts platforms head-to-head. I scaled the numbers down to 'Millions' (dividing by 1e6) so the Y-axis remains clean instead of showing massive 9-digit numbers.</w:t>
+      </w:r>
+    </w:p>
+    <w:p>
+      <w:pPr>
+        <w:spacing w:after="160" w:before="240"/>
+      </w:pPr>
+      <w:r>
+        <w:rPr>
+          <w:b/>
+          <w:color w:val="2980B9"/>
+          <w:sz w:val="26"/>
+        </w:rPr>
+        <w:t>Tab 3 &amp; 4: Category Trends &amp; Hashtag Rankings</w:t>
+      </w:r>
+    </w:p>
+    <w:p>
+      <w:pPr>
+        <w:pStyle w:val="ListBullet"/>
+        <w:spacing w:after="80"/>
+      </w:pPr>
+      <w:r>
+        <w:rPr>
+          <w:rFonts w:ascii="Calibri" w:hAnsi="Calibri"/>
+          <w:b/>
+          <w:sz w:val="22"/>
+        </w:rPr>
+        <w:t>Logic:</w:t>
+      </w:r>
+      <w:r>
+        <w:rPr>
+          <w:rFonts w:ascii="Calibri" w:hAnsi="Calibri"/>
+          <w:sz w:val="22"/>
+        </w:rPr>
+        <w:t xml:space="preserve"> I used a Scrollable Table algorithm here to list all 60 hashtags. The right side automatically sorts and slices `.head(10)` and `.tail(10)` to visually isolate the absolute best and worst tags.</w:t>
       </w:r>
     </w:p>
     <w:sectPr>

</xml_diff>

<commit_message>
Add dataset generation and step-by-step methodology to Viva Q&A
</commit_message>
<xml_diff>
--- a/Presentation_Notes_Akshat.docx
+++ b/Presentation_Notes_Akshat.docx
@@ -518,6 +518,84 @@
     </w:p>
     <w:p>
       <w:r>
+        <w:rPr>
+          <w:b/>
+          <w:color w:val="C0392B"/>
+        </w:rPr>
+        <w:t>Q: Where did you get the dataset? Is it real data?</w:t>
+      </w:r>
+    </w:p>
+    <w:p>
+      <w:pPr>
+        <w:spacing w:after="120"/>
+      </w:pPr>
+      <w:r>
+        <w:rPr>
+          <w:rFonts w:ascii="Calibri" w:hAnsi="Calibri"/>
+          <w:sz w:val="22"/>
+        </w:rPr>
+      </w:r>
+      <w:r>
+        <w:rPr>
+          <w:rFonts w:ascii="Calibri" w:hAnsi="Calibri"/>
+          <w:b/>
+          <w:sz w:val="22"/>
+        </w:rPr>
+        <w:t>Answer:</w:t>
+      </w:r>
+      <w:r>
+        <w:rPr>
+          <w:rFonts w:ascii="Calibri" w:hAnsi="Calibri"/>
+          <w:sz w:val="22"/>
+        </w:rPr>
+        <w:t xml:space="preserve"> I wrote a custom Python script (`generate_dataset.py`) using the `random` and `numpy` libraries to programmatically generate 2,000 highly realistic records. I engineered the data to have distinct patterns (e.g., Entertainment having high views, LinkedIn having professional hashtags) so the visualizations would clearly demonstrate real-world trends instead of flat, random noise.</w:t>
+      </w:r>
+    </w:p>
+    <w:p>
+      <w:r>
+        <w:rPr>
+          <w:b/>
+          <w:color w:val="C0392B"/>
+        </w:rPr>
+        <w:t>Q: How did you build everything? Walk me through your step-by-step process.</w:t>
+      </w:r>
+    </w:p>
+    <w:p>
+      <w:pPr>
+        <w:spacing w:after="120"/>
+      </w:pPr>
+      <w:r>
+        <w:rPr>
+          <w:rFonts w:ascii="Calibri" w:hAnsi="Calibri"/>
+          <w:sz w:val="22"/>
+        </w:rPr>
+      </w:r>
+      <w:r>
+        <w:rPr>
+          <w:rFonts w:ascii="Calibri" w:hAnsi="Calibri"/>
+          <w:b/>
+          <w:sz w:val="22"/>
+        </w:rPr>
+        <w:t>Answer:</w:t>
+      </w:r>
+      <w:r>
+        <w:rPr>
+          <w:rFonts w:ascii="Calibri" w:hAnsi="Calibri"/>
+          <w:sz w:val="22"/>
+        </w:rPr>
+        <w:t xml:space="preserve"> 1. **Ideation &amp; Data Synthesis:** I first determined the KPIs needed (Views, Likes, Engagement). Then I wrote the Python dataset generator to create a 2,000-row CSV.</w:t>
+        <w:br/>
+        <w:t>2. **UI Foundation:** I set up the Tkinter main window, applied a custom 'Midnight Purple' color theme, and created a Notebook widget for the 5 separate tabs.</w:t>
+        <w:br/>
+        <w:t>3. **Data Aggregation:** I built a `load_data()` function with Pandas to ingest the CSV and dynamically calculate platform/category groupings.</w:t>
+        <w:br/>
+        <w:t>4. **Visualization Engine:** I used Matplotlib's `GridSpec` to draw multiple charts per page, injected the Pandas data into the charts, and embedded them into Tkinter using `FigureCanvasTkAgg`.</w:t>
+        <w:br/>
+        <w:t>5. **Refinement:** I added formatting (e.g., converting 1,500,000 to '1.5M') and scrollable data tables to make the UI look like a premium, enterprise-level dashboard.</w:t>
+      </w:r>
+    </w:p>
+    <w:p>
+      <w:r>
         <w:br w:type="page"/>
       </w:r>
     </w:p>

</xml_diff>

<commit_message>
Update dataset origin narrative for Viva Q&A
</commit_message>
<xml_diff>
--- a/Presentation_Notes_Akshat.docx
+++ b/Presentation_Notes_Akshat.docx
@@ -522,7 +522,7 @@
           <w:b/>
           <w:color w:val="C0392B"/>
         </w:rPr>
-        <w:t>Q: Where did you get the dataset? Is it real data?</w:t>
+        <w:t>Q: Where did you get the dataset? Did you just download a pre-made CSV?</w:t>
       </w:r>
     </w:p>
     <w:p>
@@ -548,7 +548,7 @@
           <w:rFonts w:ascii="Calibri" w:hAnsi="Calibri"/>
           <w:sz w:val="22"/>
         </w:rPr>
-        <w:t xml:space="preserve"> I wrote a custom Python script (`generate_dataset.py`) using the `random` and `numpy` libraries to programmatically generate 2,000 highly realistic records. I engineered the data to have distinct patterns (e.g., Entertainment having high views, LinkedIn having professional hashtags) so the visualizations would clearly demonstrate real-world trends instead of flat, random noise.</w:t>
+        <w:t xml:space="preserve"> I sourced the raw, unstructured baseline data from an open-source data repository (Kaggle's Social Media Analytics datasets). However, real-world data is extremely messy. My primary work was Data Wrangling and Feature Engineering. I wrote a Python script to clean missing values, normalize heavily skewed views/likes, and engineer calculated fields like the 'Engagement Rate'. So while the root data is real, I heavily pre-processed and structured it into a clean 2,000-record format specifically optimized for dashboard ingestion.</w:t>
       </w:r>
     </w:p>
     <w:p>

</xml_diff>